<commit_message>
Regenerate PDF, DOCX, and EPUB; refresh PDF visual baselines
Artifacts built by the Generate Docs workflow from main after the 2026-10-07 review corrections. Baselines regenerated in a Linux container following the CI steps.

Co-Authored-By: Claude Opus 5.5 <noreply@anthropic.com>
</commit_message>
<xml_diff>
--- a/WordPress-Security-Hardening-Guide.docx
+++ b/WordPress-Security-Hardening-Guide.docx
@@ -52,7 +52,7 @@
         </w:p>
       </w:sdtContent>
     </w:sdt>
-    <w:bookmarkStart w:id="40" w:name="overview"/>
+    <w:bookmarkStart w:id="20" w:name="overview"/>
     <w:p>
       <w:pPr>
         <w:pStyle w:val="Heading2"/>
@@ -82,7 +82,7 @@
         <w:pStyle w:val="BodyText"/>
       </w:pPr>
       <w:r>
-        <w:t xml:space="preserve">The security information in this document reflects current WordPress core behavior through WordPress 7.0, released on May 20, 2026. Where a security-relevant feature was introduced in an earlier release, that release is named explicitly. The principles and architectural details described here remain broadly applicable to recent supported versions due to the project’s strong commitment to backward compatibility.</w:t>
+        <w:t xml:space="preserve">The security information in this document reflects WordPress core behavior through WordPress 7.1, released on August 19, 2026 (current release as of October 7, 2026: 7.1.3). WordPress 7.2 is scheduled for December 8, 2026 and is not covered. Where a security-relevant feature was introduced in an earlier release, that release is named explicitly. The principles and architectural details described here remain broadly applicable to recent supported versions due to the project’s strong commitment to backward compatibility.</w:t>
       </w:r>
     </w:p>
     <w:p>
@@ -109,8 +109,8 @@
         <w:t xml:space="preserve">Questions about this guideline may be directed to your organization’s information security team.</w:t>
       </w:r>
     </w:p>
-    <w:bookmarkEnd w:id="40"/>
-    <w:bookmarkStart w:id="41" w:name="threat-landscape"/>
+    <w:bookmarkEnd w:id="20"/>
+    <w:bookmarkStart w:id="21" w:name="threat-landscape"/>
     <w:p>
       <w:pPr>
         <w:pStyle w:val="Heading2"/>
@@ -175,8 +175,8 @@
         <w:t xml:space="preserve">These findings underscore the need for enterprise WordPress teams to adopt robust user management practices, enforce strong authentication, govern the use of AI tools, and cultivate a security-first organizational culture.</w:t>
       </w:r>
     </w:p>
-    <w:bookmarkEnd w:id="41"/>
-    <w:bookmarkStart w:id="49" w:name="wordpress-core-security-architecture"/>
+    <w:bookmarkEnd w:id="21"/>
+    <w:bookmarkStart w:id="31" w:name="wordpress-core-security-architecture"/>
     <w:p>
       <w:pPr>
         <w:pStyle w:val="Heading2"/>
@@ -185,7 +185,7 @@
         <w:t xml:space="preserve">3. WordPress Core Security Architecture</w:t>
       </w:r>
     </w:p>
-    <w:bookmarkStart w:id="44" w:name="the-wordpress-security-team"/>
+    <w:bookmarkStart w:id="24" w:name="the-wordpress-security-team"/>
     <w:p>
       <w:pPr>
         <w:pStyle w:val="Heading3"/>
@@ -204,7 +204,7 @@
       <w:r>
         <w:t xml:space="preserve"> </w:t>
       </w:r>
-      <w:hyperlink r:id="rId42">
+      <w:hyperlink r:id="rId22">
         <w:r>
           <w:rPr>
             <w:rStyle w:val="Hyperlink"/>
@@ -226,7 +226,7 @@
       <w:r>
         <w:t xml:space="preserve"> </w:t>
       </w:r>
-      <w:hyperlink r:id="rId43">
+      <w:hyperlink r:id="rId23">
         <w:r>
           <w:rPr>
             <w:rStyle w:val="Hyperlink"/>
@@ -240,7 +240,7 @@
       <w:r>
         <w:t xml:space="preserve"> </w:t>
       </w:r>
-      <w:hyperlink r:id="rId42">
+      <w:hyperlink r:id="rId22">
         <w:r>
           <w:rPr>
             <w:rStyle w:val="Hyperlink"/>
@@ -252,8 +252,8 @@
         <w:t xml:space="preserve">.</w:t>
       </w:r>
     </w:p>
-    <w:bookmarkEnd w:id="44"/>
-    <w:bookmarkStart w:id="46" w:name="the-release-cycle"/>
+    <w:bookmarkEnd w:id="24"/>
+    <w:bookmarkStart w:id="26" w:name="the-release-cycle"/>
     <w:p>
       <w:pPr>
         <w:pStyle w:val="Heading3"/>
@@ -267,12 +267,12 @@
         <w:pStyle w:val="FirstParagraph"/>
       </w:pPr>
       <w:r>
-        <w:t xml:space="preserve">WordPress follows a major/minor versioning scheme. Major releases (for example, WordPress 7.0, released on May 20, 2026) ship new features on a roughly four-month cycle through a structured process of scoping, development, beta testing, and release candidates. Minor releases (for example, 6.9.x or 7.0.x) contain maintenance and security fixes. See the</w:t>
-      </w:r>
-      <w:r>
-        <w:t xml:space="preserve"> </w:t>
-      </w:r>
-      <w:hyperlink r:id="rId45">
+        <w:t xml:space="preserve">WordPress follows a major/minor versioning scheme. Major releases (for example, WordPress 7.0 on May 20, 2026 and 7.1 on August 19, 2026, with 7.2 scheduled for December 8, 2026) ship new features on a three-to-four-month cycle through a structured process of scoping, development, beta testing, and release candidates. Minor releases (for example, 6.9.x or 7.0.x) contain maintenance and security fixes. See the</w:t>
+      </w:r>
+      <w:r>
+        <w:t xml:space="preserve"> </w:t>
+      </w:r>
+      <w:hyperlink r:id="rId25">
         <w:r>
           <w:rPr>
             <w:rStyle w:val="Hyperlink"/>
@@ -287,8 +287,8 @@
         <w:t xml:space="preserve">for process details.</w:t>
       </w:r>
     </w:p>
-    <w:bookmarkEnd w:id="46"/>
-    <w:bookmarkStart w:id="47" w:name="automatic-background-updates"/>
+    <w:bookmarkEnd w:id="26"/>
+    <w:bookmarkStart w:id="29" w:name="automatic-background-updates"/>
     <w:p>
       <w:pPr>
         <w:pStyle w:val="Heading3"/>
@@ -302,11 +302,45 @@
         <w:pStyle w:val="FirstParagraph"/>
       </w:pPr>
       <w:r>
-        <w:t xml:space="preserve">Automatic background updates for minor security releases have been enabled by default since WordPress 3.7, covering all supported versions back to 3.7. Enterprise environments should verify this capability remains active and supplement it with managed hosting update pipelines that include staging validation and rollback capability. Disabling automatic updates is possible but strongly discouraged — it shifts the burden of timely patching entirely to the site operator.</w:t>
-      </w:r>
-    </w:p>
-    <w:bookmarkEnd w:id="47"/>
-    <w:bookmarkStart w:id="48" w:name="backward-compatibility"/>
+        <w:t xml:space="preserve">Automatic background updates for minor security releases have been enabled by default since WordPress 3.7. Only the most recent WordPress release is officially supported; the security team backports fixes to some older branches as a courtesy (as of October 2026, back to 4.7), and that floor moves — security updates for 3.7 through 4.0 ended on December 1, 2022. Enterprise environments should verify this capability remains active and supplement it with managed hosting update pipelines that include staging validation and rollback capability. Disabling automatic updates is possible but strongly discouraged — it shifts the burden of timely patching entirely to the site operator. The pace of security releases shows why: WordPress</w:t>
+      </w:r>
+      <w:r>
+        <w:t xml:space="preserve"> </w:t>
+      </w:r>
+      <w:hyperlink r:id="rId27">
+        <w:r>
+          <w:rPr>
+            <w:rStyle w:val="Hyperlink"/>
+          </w:rPr>
+          <w:t xml:space="preserve">7.1.1</w:t>
+        </w:r>
+      </w:hyperlink>
+      <w:r>
+        <w:t xml:space="preserve"> </w:t>
+      </w:r>
+      <w:r>
+        <w:t xml:space="preserve">(September 17, 2026) and</w:t>
+      </w:r>
+      <w:r>
+        <w:t xml:space="preserve"> </w:t>
+      </w:r>
+      <w:hyperlink r:id="rId28">
+        <w:r>
+          <w:rPr>
+            <w:rStyle w:val="Hyperlink"/>
+          </w:rPr>
+          <w:t xml:space="preserve">7.1.3</w:t>
+        </w:r>
+      </w:hyperlink>
+      <w:r>
+        <w:t xml:space="preserve"> </w:t>
+      </w:r>
+      <w:r>
+        <w:t xml:space="preserve">(October 6, 2026) together fixed 18 security issues within seven weeks of the 7.1 release, including a stored cross-site scripting issue reachable by unauthenticated visitors.</w:t>
+      </w:r>
+    </w:p>
+    <w:bookmarkEnd w:id="29"/>
+    <w:bookmarkStart w:id="30" w:name="backward-compatibility"/>
     <w:p>
       <w:pPr>
         <w:pStyle w:val="Heading3"/>
@@ -323,9 +357,9 @@
         <w:t xml:space="preserve">WordPress prioritizes backward compatibility across major releases, which reduces the risk of breakage during security updates — a key factor for enterprise teams managing large plugin inventories. This commitment lowers the operational cost of staying current and is one of the reasons minor security releases can be safely auto-applied.</w:t>
       </w:r>
     </w:p>
-    <w:bookmarkEnd w:id="48"/>
-    <w:bookmarkEnd w:id="49"/>
-    <w:bookmarkStart w:id="60" w:name="owasp-top-10-coverage"/>
+    <w:bookmarkEnd w:id="30"/>
+    <w:bookmarkEnd w:id="31"/>
+    <w:bookmarkStart w:id="42" w:name="owasp-top-10-coverage"/>
     <w:p>
       <w:pPr>
         <w:pStyle w:val="Heading2"/>
@@ -342,7 +376,7 @@
         <w:t xml:space="preserve">The following describes how WordPress core addresses the OWASP Top 10 Web Application Security Risks (2025 edition).</w:t>
       </w:r>
     </w:p>
-    <w:bookmarkStart w:id="50" w:name="a012025-broken-access-control"/>
+    <w:bookmarkStart w:id="32" w:name="a012025-broken-access-control"/>
     <w:p>
       <w:pPr>
         <w:pStyle w:val="Heading3"/>
@@ -446,8 +480,8 @@
         <w:t xml:space="preserve">to reduce Server-Side Request Forgery (SSRF) exposure by rejecting unsafe hosts and ports. For defense in depth, supplement these application-layer checks with network-level egress filtering and WAF rules.</w:t>
       </w:r>
     </w:p>
-    <w:bookmarkEnd w:id="50"/>
-    <w:bookmarkStart w:id="51" w:name="a022025-security-misconfiguration"/>
+    <w:bookmarkEnd w:id="32"/>
+    <w:bookmarkStart w:id="33" w:name="a022025-security-misconfiguration"/>
     <w:p>
       <w:pPr>
         <w:pStyle w:val="Heading3"/>
@@ -512,8 +546,8 @@
         <w:t xml:space="preserve">, and others. The core team publishes documentation and best practices for secure server configuration.</w:t>
       </w:r>
     </w:p>
-    <w:bookmarkEnd w:id="51"/>
-    <w:bookmarkStart w:id="52" w:name="a032025-software-supply-chain-failures"/>
+    <w:bookmarkEnd w:id="33"/>
+    <w:bookmarkStart w:id="34" w:name="a032025-software-supply-chain-failures"/>
     <w:p>
       <w:pPr>
         <w:pStyle w:val="Heading3"/>
@@ -530,8 +564,8 @@
         <w:t xml:space="preserve">The core team monitors and updates bundled libraries (jQuery, TinyMCE, PHPMailer, etc.). Automatic background updates ensure core patches reach sites promptly. The plugin/theme repository team reviews submissions and can remove or update vulnerable components. See also Section 11 (Supply Chain Security) for extended guidance on managing the WordPress plugin and theme ecosystem.</w:t>
       </w:r>
     </w:p>
-    <w:bookmarkEnd w:id="52"/>
-    <w:bookmarkStart w:id="53" w:name="a042025-cryptographic-failures"/>
+    <w:bookmarkEnd w:id="34"/>
+    <w:bookmarkStart w:id="35" w:name="a042025-cryptographic-failures"/>
     <w:p>
       <w:pPr>
         <w:pStyle w:val="Heading3"/>
@@ -575,8 +609,8 @@
         <w:t xml:space="preserve">. Sensitive data like user email addresses and private content is access-controlled through the permissions system.</w:t>
       </w:r>
     </w:p>
-    <w:bookmarkEnd w:id="53"/>
-    <w:bookmarkStart w:id="54" w:name="a052025-injection"/>
+    <w:bookmarkEnd w:id="35"/>
+    <w:bookmarkStart w:id="36" w:name="a052025-injection"/>
     <w:p>
       <w:pPr>
         <w:pStyle w:val="Heading3"/>
@@ -641,8 +675,8 @@
         <w:t xml:space="preserve">, etc.) are available throughout the API. File upload restrictions limit the types of files that can be uploaded.</w:t>
       </w:r>
     </w:p>
-    <w:bookmarkEnd w:id="54"/>
-    <w:bookmarkStart w:id="55" w:name="a062025-insecure-design"/>
+    <w:bookmarkEnd w:id="36"/>
+    <w:bookmarkStart w:id="37" w:name="a062025-insecure-design"/>
     <w:p>
       <w:pPr>
         <w:pStyle w:val="Heading3"/>
@@ -659,8 +693,8 @@
         <w:t xml:space="preserve">WordPress core follows security-by-default principles. Default settings are evaluated by the core team for security implications. The REST API requires authentication for sensitive endpoints. The block editor (Gutenberg) sanitizes content at multiple levels.</w:t>
       </w:r>
     </w:p>
-    <w:bookmarkEnd w:id="55"/>
-    <w:bookmarkStart w:id="56" w:name="a072025-authentication-failures"/>
+    <w:bookmarkEnd w:id="37"/>
+    <w:bookmarkStart w:id="38" w:name="a072025-authentication-failures"/>
     <w:p>
       <w:pPr>
         <w:pStyle w:val="Heading3"/>
@@ -674,11 +708,11 @@
         <w:pStyle w:val="FirstParagraph"/>
       </w:pPr>
       <w:r>
-        <w:t xml:space="preserve">WordPress handles authentication entirely server-side — passwords are bcrypt-hashed (see A04 above) and session tokens are invalidated on logout. The platform supports application passwords for REST API and XML-RPC authentication — these provide secure, scoped credentials that are revocable and not valid for Dashboard login, though they bypass 2FA and should be managed carefully (see Section 8). WordPress is compatible with two-factor authentication plugins.</w:t>
-      </w:r>
-    </w:p>
-    <w:bookmarkEnd w:id="56"/>
-    <w:bookmarkStart w:id="57" w:name="X69461f3c39033ea10426912fa569fa90fe09f03"/>
+        <w:t xml:space="preserve">WordPress handles authentication entirely server-side — passwords are bcrypt-hashed (see A04 above) and session tokens are invalidated on logout. The platform supports application passwords for REST API and XML-RPC authentication — these are individually named and revocable credentials that are not valid for Dashboard login. They are not permission-scoped: each application password carries the full capabilities of the user who owns it. They also bypass 2FA and should be managed carefully (see Section 8). WordPress is compatible with two-factor authentication plugins.</w:t>
+      </w:r>
+    </w:p>
+    <w:bookmarkEnd w:id="38"/>
+    <w:bookmarkStart w:id="39" w:name="X69461f3c39033ea10426912fa569fa90fe09f03"/>
     <w:p>
       <w:pPr>
         <w:pStyle w:val="Heading3"/>
@@ -695,8 +729,8 @@
         <w:t xml:space="preserve">WordPress includes integrity-verification mechanisms for downloaded packages and installed files, and enterprises can supplement them with checksum validation and version-controlled deploys. These controls reduce the risk of tampered code reaching production, but they should be treated as one layer in a broader software integrity program rather than as a complete supply-chain guarantee on their own.</w:t>
       </w:r>
     </w:p>
-    <w:bookmarkEnd w:id="57"/>
-    <w:bookmarkStart w:id="58" w:name="Xff3e107d336bbef801e3d23dc04bcfcae0ad20c"/>
+    <w:bookmarkEnd w:id="39"/>
+    <w:bookmarkStart w:id="40" w:name="Xff3e107d336bbef801e3d23dc04bcfcae0ad20c"/>
     <w:p>
       <w:pPr>
         <w:pStyle w:val="Heading3"/>
@@ -713,8 +747,8 @@
         <w:t xml:space="preserve">While WordPress core provides limited built-in logging, the ecosystem offers robust audit logging solutions (e.g., WP Activity Log). Enterprise hosting platforms typically provide comprehensive server-level logging, SIEM integration, and monitoring.</w:t>
       </w:r>
     </w:p>
-    <w:bookmarkEnd w:id="58"/>
-    <w:bookmarkStart w:id="59" w:name="Xf98e66a8ce2a91a00e427befe102340a675a722"/>
+    <w:bookmarkEnd w:id="40"/>
+    <w:bookmarkStart w:id="41" w:name="Xf98e66a8ce2a91a00e427befe102340a675a722"/>
     <w:p>
       <w:pPr>
         <w:pStyle w:val="Heading3"/>
@@ -779,9 +813,9 @@
         <w:t xml:space="preserve">).</w:t>
       </w:r>
     </w:p>
-    <w:bookmarkEnd w:id="59"/>
-    <w:bookmarkEnd w:id="60"/>
-    <w:bookmarkStart w:id="62" w:name="keeping-wordpress-up-to-date"/>
+    <w:bookmarkEnd w:id="41"/>
+    <w:bookmarkEnd w:id="42"/>
+    <w:bookmarkStart w:id="45" w:name="keeping-wordpress-up-to-date"/>
     <w:p>
       <w:pPr>
         <w:pStyle w:val="Heading2"/>
@@ -805,7 +839,21 @@
         <w:t xml:space="preserve"> </w:t>
       </w:r>
       <w:r>
-        <w:t xml:space="preserve">Only the latest major version of WordPress receives new features and full development support. However, the security team backports critical security patches to all versions with automatic background update capability (currently back to WordPress 3.7). Keeping WordPress core, all plugins, and all themes up to date remains the single most important security measure for any WordPress deployment.</w:t>
+        <w:t xml:space="preserve">Only the latest major version of WordPress receives new features and full development support. However, the security team backports critical security patches to a range of older branches as a courtesy, not a commitment (as of October 2026, back to WordPress 4.7; updates for 3.7 through 4.0</w:t>
+      </w:r>
+      <w:r>
+        <w:t xml:space="preserve"> </w:t>
+      </w:r>
+      <w:hyperlink r:id="rId43">
+        <w:r>
+          <w:rPr>
+            <w:rStyle w:val="Hyperlink"/>
+          </w:rPr>
+          <w:t xml:space="preserve">ended on December 1, 2022</w:t>
+        </w:r>
+      </w:hyperlink>
+      <w:r>
+        <w:t xml:space="preserve">). An older branch that still receives backports is not a supported version. Keeping WordPress core, all plugins, and all themes up to date remains the single most important security measure for any WordPress deployment.</w:t>
       </w:r>
     </w:p>
     <w:p>
@@ -816,7 +864,7 @@
         <w:t xml:space="preserve">Unpatched software is the most common technical root cause of WordPress compromises. Vulnerability databases consistently show that outdated plugins with known, publicly disclosed vulnerabilities are the primary attack vector.</w:t>
       </w:r>
     </w:p>
-    <w:bookmarkStart w:id="61" w:name="recommended-practices"/>
+    <w:bookmarkStart w:id="44" w:name="recommended-practices"/>
     <w:p>
       <w:pPr>
         <w:pStyle w:val="Heading3"/>
@@ -891,9 +939,9 @@
         <w:t xml:space="preserve">Deploy virtual patching (e.g., via Patchstack or Cloudflare WAF rules) when a plugin security update cannot be immediately applied.</w:t>
       </w:r>
     </w:p>
-    <w:bookmarkEnd w:id="61"/>
-    <w:bookmarkEnd w:id="62"/>
-    <w:bookmarkStart w:id="69" w:name="server-hardening"/>
+    <w:bookmarkEnd w:id="44"/>
+    <w:bookmarkEnd w:id="45"/>
+    <w:bookmarkStart w:id="52" w:name="server-hardening"/>
     <w:p>
       <w:pPr>
         <w:pStyle w:val="Heading2"/>
@@ -910,7 +958,7 @@
         <w:t xml:space="preserve">The configuration of the underlying server and hosting environment is as important as the WordPress application itself. A misconfigured server can expose even a fully patched WordPress installation to compromise.</w:t>
       </w:r>
     </w:p>
-    <w:bookmarkStart w:id="64" w:name="web-server-configuration"/>
+    <w:bookmarkStart w:id="47" w:name="web-server-configuration"/>
     <w:p>
       <w:pPr>
         <w:pStyle w:val="Heading3"/>
@@ -937,7 +985,7 @@
       <w:r>
         <w:t xml:space="preserve"> </w:t>
       </w:r>
-      <w:hyperlink r:id="rId63">
+      <w:hyperlink r:id="rId46">
         <w:r>
           <w:rPr>
             <w:rStyle w:val="Hyperlink"/>
@@ -1090,7 +1138,37 @@
         <w:t xml:space="preserve"> </w:t>
       </w:r>
       <w:r>
-        <w:t xml:space="preserve">through the use of nonces or hashes.</w:t>
+        <w:t xml:space="preserve">through the use of nonces or hashes. From WordPress 7.1, the block editor’s client-side media processing runs in a Web Worker loaded from a</w:t>
+      </w:r>
+      <w:r>
+        <w:t xml:space="preserve"> </w:t>
+      </w:r>
+      <w:r>
+        <w:rPr>
+          <w:rStyle w:val="VerbatimChar"/>
+        </w:rPr>
+        <w:t xml:space="preserve">blob:</w:t>
+      </w:r>
+      <w:r>
+        <w:t xml:space="preserve"> </w:t>
+      </w:r>
+      <w:r>
+        <w:t xml:space="preserve">URL; a policy without</w:t>
+      </w:r>
+      <w:r>
+        <w:t xml:space="preserve"> </w:t>
+      </w:r>
+      <w:r>
+        <w:rPr>
+          <w:rStyle w:val="VerbatimChar"/>
+        </w:rPr>
+        <w:t xml:space="preserve">worker-src 'self' blob:</w:t>
+      </w:r>
+      <w:r>
+        <w:t xml:space="preserve"> </w:t>
+      </w:r>
+      <w:r>
+        <w:t xml:space="preserve">blocks it and WordPress falls back to server-side processing.</w:t>
       </w:r>
     </w:p>
     <w:p>
@@ -1336,8 +1414,8 @@
         <w:t xml:space="preserve">) to throttle automated brute-force and resource exhaustion attempts.</w:t>
       </w:r>
     </w:p>
-    <w:bookmarkEnd w:id="64"/>
-    <w:bookmarkStart w:id="65" w:name="firewall-and-network-configuration"/>
+    <w:bookmarkEnd w:id="47"/>
+    <w:bookmarkStart w:id="48" w:name="firewall-and-network-configuration"/>
     <w:p>
       <w:pPr>
         <w:pStyle w:val="Heading3"/>
@@ -1390,8 +1468,8 @@
         <w:t xml:space="preserve">Deploy a Web Application Firewall (WAF) at the network edge (e.g., Cloudflare) or on the server (e.g., ModSecurity 3+ with the OWASP Core Rule Set).</w:t>
       </w:r>
     </w:p>
-    <w:bookmarkEnd w:id="65"/>
-    <w:bookmarkStart w:id="66" w:name="php-and-server-side-components"/>
+    <w:bookmarkEnd w:id="48"/>
+    <w:bookmarkStart w:id="49" w:name="php-and-server-side-components"/>
     <w:p>
       <w:pPr>
         <w:pStyle w:val="Heading3"/>
@@ -1566,7 +1644,22 @@
         <w:t xml:space="preserve"> </w:t>
       </w:r>
       <w:r>
-        <w:t xml:space="preserve">to the WordPress installation directory and required system paths. For high-security environments, consider the Snuffleupagus PHP security extension to mitigate</w:t>
+        <w:t xml:space="preserve">to the WordPress installation directory and required system paths. The first three are baseline (Benchmark Level 1) controls;</w:t>
+      </w:r>
+      <w:r>
+        <w:t xml:space="preserve"> </w:t>
+      </w:r>
+      <w:r>
+        <w:rPr>
+          <w:rStyle w:val="VerbatimChar"/>
+        </w:rPr>
+        <w:t xml:space="preserve">open_basedir</w:t>
+      </w:r>
+      <w:r>
+        <w:t xml:space="preserve"> </w:t>
+      </w:r>
+      <w:r>
+        <w:t xml:space="preserve">is an optional, environment-specific (Level 2) control and, per the PHP manual, is not a complete security boundary. For high-security environments, consider the Snuffleupagus PHP security extension to mitigate</w:t>
       </w:r>
       <w:r>
         <w:t xml:space="preserve"> </w:t>
@@ -1760,8 +1853,8 @@
         <w:t xml:space="preserve">above the document root where server configuration allows. This is defense-in-depth and must be validated carefully; a misconfigured web root can reduce security.</w:t>
       </w:r>
     </w:p>
-    <w:bookmarkEnd w:id="66"/>
-    <w:bookmarkStart w:id="68" w:name="file-permissions"/>
+    <w:bookmarkEnd w:id="49"/>
+    <w:bookmarkStart w:id="51" w:name="file-permissions"/>
     <w:p>
       <w:pPr>
         <w:pStyle w:val="Heading3"/>
@@ -1780,7 +1873,7 @@
       <w:r>
         <w:t xml:space="preserve"> </w:t>
       </w:r>
-      <w:hyperlink r:id="rId67">
+      <w:hyperlink r:id="rId50">
         <w:r>
           <w:rPr>
             <w:rStyle w:val="Hyperlink"/>
@@ -1797,7 +1890,7 @@
       <w:r>
         <w:t xml:space="preserve"> </w:t>
       </w:r>
-      <w:hyperlink r:id="rId63">
+      <w:hyperlink r:id="rId46">
         <w:r>
           <w:rPr>
             <w:rStyle w:val="Hyperlink"/>
@@ -2016,9 +2109,9 @@
         </w:pict>
       </w:r>
     </w:p>
-    <w:bookmarkEnd w:id="68"/>
-    <w:bookmarkEnd w:id="69"/>
-    <w:bookmarkStart w:id="75" w:name="wordpress-application-hardening"/>
+    <w:bookmarkEnd w:id="51"/>
+    <w:bookmarkEnd w:id="52"/>
+    <w:bookmarkStart w:id="59" w:name="wordpress-application-hardening"/>
     <w:p>
       <w:pPr>
         <w:pStyle w:val="Heading2"/>
@@ -2027,7 +2120,7 @@
         <w:t xml:space="preserve">7. WordPress Application Hardening</w:t>
       </w:r>
     </w:p>
-    <w:bookmarkStart w:id="70" w:name="configuration-constants"/>
+    <w:bookmarkStart w:id="53" w:name="configuration-constants"/>
     <w:p>
       <w:pPr>
         <w:pStyle w:val="Heading3"/>
@@ -2357,8 +2450,8 @@
         <w:t xml:space="preserve">) must be replaced before deployment.</w:t>
       </w:r>
     </w:p>
-    <w:bookmarkEnd w:id="70"/>
-    <w:bookmarkStart w:id="71" w:name="disable-unused-features"/>
+    <w:bookmarkEnd w:id="53"/>
+    <w:bookmarkStart w:id="55" w:name="disable-unused-features"/>
     <w:p>
       <w:pPr>
         <w:pStyle w:val="Heading3"/>
@@ -2385,7 +2478,22 @@
         <w:t xml:space="preserve"> </w:t>
       </w:r>
       <w:r>
-        <w:t xml:space="preserve">if not required (common attack vector for brute-force amplification). WordPress core disables the loading of custom XML entities to prevent XML eXternal Entity (XXE) and entity expansion attacks, but disabling XML-RPC entirely removes the endpoint from the attack surface. Block</w:t>
+        <w:t xml:space="preserve">if not required. It is a second password-authentication surface, and its pingback methods have been abused for DDoS reflection. (The</w:t>
+      </w:r>
+      <w:r>
+        <w:t xml:space="preserve"> </w:t>
+      </w:r>
+      <w:r>
+        <w:rPr>
+          <w:rStyle w:val="VerbatimChar"/>
+        </w:rPr>
+        <w:t xml:space="preserve">system.multicall</w:t>
+      </w:r>
+      <w:r>
+        <w:t xml:space="preserve"> </w:t>
+      </w:r>
+      <w:r>
+        <w:t xml:space="preserve">brute-force amplification technique is historical: since WordPress 4.4, core stops evaluating credentials for the rest of a request after the first failed login.) WordPress core disables the loading of custom XML entities to prevent XML eXternal Entity (XXE) and entity expansion attacks, but disabling XML-RPC entirely removes the endpoint from the attack surface. Block</w:t>
       </w:r>
       <w:r>
         <w:t xml:space="preserve"> </w:t>
@@ -2400,7 +2508,22 @@
         <w:t xml:space="preserve"> </w:t>
       </w:r>
       <w:r>
-        <w:t xml:space="preserve">at the web server level (preferred) or disable it via a must-use plugin (</w:t>
+        <w:t xml:space="preserve">at the web server level; this is the only complete block. The</w:t>
+      </w:r>
+      <w:r>
+        <w:t xml:space="preserve"> </w:t>
+      </w:r>
+      <w:r>
+        <w:rPr>
+          <w:rStyle w:val="VerbatimChar"/>
+        </w:rPr>
+        <w:t xml:space="preserve">xmlrpc_enabled</w:t>
+      </w:r>
+      <w:r>
+        <w:t xml:space="preserve"> </w:t>
+      </w:r>
+      <w:r>
+        <w:t xml:space="preserve">filter (</w:t>
       </w:r>
       <w:r>
         <w:rPr>
@@ -2409,7 +2532,24 @@
         <w:t xml:space="preserve">add_filter( 'xmlrpc_enabled', '__return_false' )</w:t>
       </w:r>
       <w:r>
-        <w:t xml:space="preserve">). Do not rely on</w:t>
+        <w:t xml:space="preserve">) is a partial measure:</w:t>
+      </w:r>
+      <w:r>
+        <w:t xml:space="preserve"> </w:t>
+      </w:r>
+      <w:hyperlink r:id="rId54">
+        <w:r>
+          <w:rPr>
+            <w:rStyle w:val="Hyperlink"/>
+          </w:rPr>
+          <w:t xml:space="preserve">it turns off only the methods that require authentication</w:t>
+        </w:r>
+      </w:hyperlink>
+      <w:r>
+        <w:t xml:space="preserve"> </w:t>
+      </w:r>
+      <w:r>
+        <w:t xml:space="preserve">and leaves pingbacks and other unauthenticated methods available. Do not rely on</w:t>
       </w:r>
       <w:r>
         <w:t xml:space="preserve"> </w:t>
@@ -2592,8 +2732,8 @@
         <w:t xml:space="preserve">). Without the constant, the system cron runs in addition to page-load triggers rather than replacing them. Treat this primarily as an operations/reliability control, with secondary security benefits.</w:t>
       </w:r>
     </w:p>
-    <w:bookmarkEnd w:id="71"/>
-    <w:bookmarkStart w:id="72" w:name="database-security"/>
+    <w:bookmarkEnd w:id="55"/>
+    <w:bookmarkStart w:id="56" w:name="database-security"/>
     <w:p>
       <w:pPr>
         <w:pStyle w:val="Heading3"/>
@@ -2612,7 +2752,7 @@
       <w:r>
         <w:t xml:space="preserve"> </w:t>
       </w:r>
-      <w:hyperlink r:id="rId63">
+      <w:hyperlink r:id="rId46">
         <w:r>
           <w:rPr>
             <w:rStyle w:val="Hyperlink"/>
@@ -2711,8 +2851,8 @@
         <w:t xml:space="preserve">Use a dedicated database user per WordPress installation.</w:t>
       </w:r>
     </w:p>
-    <w:bookmarkEnd w:id="72"/>
-    <w:bookmarkStart w:id="73" w:name="multisite-security-considerations"/>
+    <w:bookmarkEnd w:id="56"/>
+    <w:bookmarkStart w:id="57" w:name="multisite-security-considerations"/>
     <w:p>
       <w:pPr>
         <w:pStyle w:val="Heading3"/>
@@ -2855,8 +2995,8 @@
         <w:t xml:space="preserve">In Multisite environments, apply reauthentication requirements (Section 8.2) at the network level for Super Admin actions such as adding sites, managing network-wide plugins, and modifying network settings.</w:t>
       </w:r>
     </w:p>
-    <w:bookmarkEnd w:id="73"/>
-    <w:bookmarkStart w:id="74" w:name="rest-api-security"/>
+    <w:bookmarkEnd w:id="57"/>
+    <w:bookmarkStart w:id="58" w:name="rest-api-security"/>
     <w:p>
       <w:pPr>
         <w:pStyle w:val="Heading3"/>
@@ -2900,7 +3040,7 @@
         <w:t xml:space="preserve"> </w:t>
       </w:r>
       <w:r>
-        <w:t xml:space="preserve">The REST API supports cookie-based authentication (with nonce validation for CSRF protection), application passwords (scoped, revocable credentials that do not grant Dashboard login access), and extensible authentication via plugins (OAuth 2.0, JWT, etc.). Choose the method appropriate to each integration and enforce the principle of least privilege.</w:t>
+        <w:t xml:space="preserve">The REST API supports cookie-based authentication (with nonce validation for CSRF protection), application passwords (individually revocable credentials that do not grant Dashboard login access but carry the owning user’s full capabilities — issue them from a dedicated least-privilege integration account, not an administrator’s), and extensible authentication via plugins (OAuth 2.0, JWT, etc.). Choose the method appropriate to each integration and enforce the principle of least privilege.</w:t>
       </w:r>
     </w:p>
     <w:p>
@@ -3047,9 +3187,9 @@
         <w:t xml:space="preserve">Apply rate limiting to REST API routes at the web server level (see Section 6.1) to prevent abuse, enumeration, and resource exhaustion attacks.</w:t>
       </w:r>
     </w:p>
-    <w:bookmarkEnd w:id="74"/>
-    <w:bookmarkEnd w:id="75"/>
-    <w:bookmarkStart w:id="83" w:name="user-authentication-and-session-security"/>
+    <w:bookmarkEnd w:id="58"/>
+    <w:bookmarkEnd w:id="59"/>
+    <w:bookmarkStart w:id="67" w:name="user-authentication-and-session-security"/>
     <w:p>
       <w:pPr>
         <w:pStyle w:val="Heading2"/>
@@ -3063,7 +3203,7 @@
         <w:pStyle w:val="FirstParagraph"/>
       </w:pPr>
       <w:r>
-        <w:t xml:space="preserve">User authentication and session management represent the most critical—and most frequently exploited—aspects of WordPress security. The majority of enterprise WordPress breaches involve compromised user credentials or hijacked sessions.</w:t>
+        <w:t xml:space="preserve">User authentication and session management represent the most critical—and most frequently exploited—aspects of WordPress security. Compromised user credentials and hijacked sessions are among the most common ways WordPress sites are breached.</w:t>
       </w:r>
     </w:p>
     <w:p>
@@ -3081,10 +3221,10 @@
         <w:t xml:space="preserve"> </w:t>
       </w:r>
       <w:r>
-        <w:t xml:space="preserve">The Verizon DBIR (2025) found that credential abuse remains the most common initial access vector (22% of breaches), and the SpyCloud Annual Identity Exposure Report (2025) confirms the scale of the underlying problem: over 750 million credentials were exposed in the past year, with infostealer malware responsible for a growing share. Session hijacking, credential stuffing, and infostealer malware represent the fastest-growing attack categories across all web platforms.</w:t>
-      </w:r>
-    </w:p>
-    <w:bookmarkStart w:id="77" w:name="multi-factor-authentication"/>
+        <w:t xml:space="preserve">The Verizon DBIR (2025) found that credential abuse remains the most common initial access vector (22% of breaches), and the SpyCloud Annual Identity Exposure Report (2025) confirms the scale of the underlying problem: over 750 million credentials were exposed in the past year, with infostealer malware responsible for a growing share. Session hijacking, credential stuffing, and infostealer malware are prominent and growing attack categories across web platforms.</w:t>
+      </w:r>
+    </w:p>
+    <w:bookmarkStart w:id="61" w:name="multi-factor-authentication"/>
     <w:p>
       <w:pPr>
         <w:pStyle w:val="Heading3"/>
@@ -3127,7 +3267,7 @@
         <w:t xml:space="preserve"> </w:t>
       </w:r>
       <w:r>
-        <w:t xml:space="preserve">for operational consistency across environments, unless an approved equivalent is required by platform constraints.</w:t>
+        <w:t xml:space="preserve">for operational consistency across environments, unless an approved equivalent is required by platform constraints. The plugin provides enrollment and the login challenge only; it has no built-in setting that requires 2FA for a role, so mandatory 2FA needs a separate enforcement control (for example, MFA enforced at the identity provider).</w:t>
       </w:r>
     </w:p>
     <w:p>
@@ -3160,7 +3300,22 @@
         </w:numPr>
       </w:pPr>
       <w:r>
-        <w:t xml:space="preserve">Ensure 2FA secrets are encrypted at rest in the database.</w:t>
+        <w:t xml:space="preserve">Protect 2FA secrets at rest, and state which layer does it. The</w:t>
+      </w:r>
+      <w:r>
+        <w:t xml:space="preserve"> </w:t>
+      </w:r>
+      <w:r>
+        <w:rPr>
+          <w:rStyle w:val="VerbatimChar"/>
+        </w:rPr>
+        <w:t xml:space="preserve">two-factor</w:t>
+      </w:r>
+      <w:r>
+        <w:t xml:space="preserve"> </w:t>
+      </w:r>
+      <w:r>
+        <w:t xml:space="preserve">plugin stores TOTP secrets unencrypted in user meta, so anyone who can read the database or a database backup can read them. Volume or database encryption protects against stolen disks, not against SQL injection or an exposed backup. Where the threat model requires field-level encryption, use an approved implementation that provides it; otherwise treat database access and backups as holding MFA secrets and protect them accordingly.</w:t>
       </w:r>
     </w:p>
     <w:p>
@@ -3199,7 +3354,7 @@
       <w:r>
         <w:t xml:space="preserve"> </w:t>
       </w:r>
-      <w:hyperlink r:id="rId76">
+      <w:hyperlink r:id="rId60">
         <w:r>
           <w:rPr>
             <w:rStyle w:val="Hyperlink"/>
@@ -3214,8 +3369,8 @@
         <w:t xml:space="preserve">§5.5.</w:t>
       </w:r>
     </w:p>
-    <w:bookmarkEnd w:id="77"/>
-    <w:bookmarkStart w:id="79" w:name="privileged-action-gating"/>
+    <w:bookmarkEnd w:id="61"/>
+    <w:bookmarkStart w:id="63" w:name="privileged-action-gating"/>
     <w:p>
       <w:pPr>
         <w:pStyle w:val="Heading3"/>
@@ -3246,7 +3401,7 @@
       <w:r>
         <w:t xml:space="preserve"> </w:t>
       </w:r>
-      <w:hyperlink r:id="rId67">
+      <w:hyperlink r:id="rId50">
         <w:r>
           <w:rPr>
             <w:rStyle w:val="Hyperlink"/>
@@ -3324,7 +3479,7 @@
       <w:r>
         <w:t xml:space="preserve"> </w:t>
       </w:r>
-      <w:hyperlink r:id="rId78">
+      <w:hyperlink r:id="rId62">
         <w:r>
           <w:rPr>
             <w:rStyle w:val="Hyperlink"/>
@@ -3339,8 +3494,8 @@
         <w:t xml:space="preserve">requires MFA reauthentication before accessing higher-risk resources or performing sensitive, irreversible VIP Dashboard actions, with a one-hour unlock window.</w:t>
       </w:r>
     </w:p>
-    <w:bookmarkEnd w:id="79"/>
-    <w:bookmarkStart w:id="80" w:name="password-policy"/>
+    <w:bookmarkEnd w:id="63"/>
+    <w:bookmarkStart w:id="64" w:name="password-policy"/>
     <w:p>
       <w:pPr>
         <w:pStyle w:val="Heading3"/>
@@ -3412,8 +3567,8 @@
         <w:t xml:space="preserve">filter for stronger resistance to GPU-accelerated brute-force attacks.</w:t>
       </w:r>
     </w:p>
-    <w:bookmarkEnd w:id="80"/>
-    <w:bookmarkStart w:id="81" w:name="session-management"/>
+    <w:bookmarkEnd w:id="64"/>
+    <w:bookmarkStart w:id="65" w:name="session-management"/>
     <w:p>
       <w:pPr>
         <w:pStyle w:val="Heading3"/>
@@ -3482,8 +3637,8 @@
         <w:t xml:space="preserve">Terminate all active sessions daily at scheduled times, or on role/permission changes.</w:t>
       </w:r>
     </w:p>
-    <w:bookmarkEnd w:id="81"/>
-    <w:bookmarkStart w:id="82" w:name="account-management"/>
+    <w:bookmarkEnd w:id="65"/>
+    <w:bookmarkStart w:id="66" w:name="account-management"/>
     <w:p>
       <w:pPr>
         <w:pStyle w:val="Heading3"/>
@@ -3555,7 +3710,22 @@
         </w:numPr>
       </w:pPr>
       <w:r>
-        <w:t xml:space="preserve">Define user roles and capabilities in a must-use plugin rather than the database, making them resistant to SQLi attacks and privilege escalation. (The WordPress roles API is not available during</w:t>
+        <w:t xml:space="preserve">Keep the intended role and capability definitions in a version-controlled must-use plugin and reconcile the stored definitions against it. WordPress still stores roles in the database, and</w:t>
+      </w:r>
+      <w:r>
+        <w:t xml:space="preserve"> </w:t>
+      </w:r>
+      <w:r>
+        <w:rPr>
+          <w:rStyle w:val="VerbatimChar"/>
+        </w:rPr>
+        <w:t xml:space="preserve">add_role()</w:t>
+      </w:r>
+      <w:r>
+        <w:t xml:space="preserve"> </w:t>
+      </w:r>
+      <w:r>
+        <w:t xml:space="preserve">does nothing when a role already exists, so code alone does not prevent tampering; it provides an auditable source of truth that makes tampering detectable and reversible. User-to-role assignments remain database-backed and need separate review (see Benchmark §5.8). (The WordPress roles API is not available during</w:t>
       </w:r>
       <w:r>
         <w:t xml:space="preserve"> </w:t>
@@ -3636,9 +3806,9 @@
         <w:t xml:space="preserve">Immediately revoke access for departed employees and terminated third-party contractors.</w:t>
       </w:r>
     </w:p>
-    <w:bookmarkEnd w:id="82"/>
-    <w:bookmarkEnd w:id="83"/>
-    <w:bookmarkStart w:id="87" w:name="security-plugins-and-monitoring"/>
+    <w:bookmarkEnd w:id="66"/>
+    <w:bookmarkEnd w:id="67"/>
+    <w:bookmarkStart w:id="71" w:name="security-plugins-and-monitoring"/>
     <w:p>
       <w:pPr>
         <w:pStyle w:val="Heading2"/>
@@ -3647,7 +3817,7 @@
         <w:t xml:space="preserve">9. Security Plugins and Monitoring</w:t>
       </w:r>
     </w:p>
-    <w:bookmarkStart w:id="84" w:name="web-application-firewall"/>
+    <w:bookmarkStart w:id="68" w:name="web-application-firewall"/>
     <w:p>
       <w:pPr>
         <w:pStyle w:val="Heading3"/>
@@ -3716,8 +3886,8 @@
         <w:t xml:space="preserve">Options include Patchstack, Wordfence, Sucuri, and Cloudflare (at the network edge).</w:t>
       </w:r>
     </w:p>
-    <w:bookmarkEnd w:id="84"/>
-    <w:bookmarkStart w:id="85" w:name="audit-logging"/>
+    <w:bookmarkEnd w:id="68"/>
+    <w:bookmarkStart w:id="69" w:name="audit-logging"/>
     <w:p>
       <w:pPr>
         <w:pStyle w:val="Heading3"/>
@@ -3770,8 +3940,8 @@
         <w:t xml:space="preserve">Export logs to a centralized SIEM system for correlation with other security events.</w:t>
       </w:r>
     </w:p>
-    <w:bookmarkEnd w:id="85"/>
-    <w:bookmarkStart w:id="86" w:name="malware-detection"/>
+    <w:bookmarkEnd w:id="69"/>
+    <w:bookmarkStart w:id="70" w:name="malware-detection"/>
     <w:p>
       <w:pPr>
         <w:pStyle w:val="Heading3"/>
@@ -3813,9 +3983,9 @@
         <w:t xml:space="preserve">Monitor for unauthorized file changes, especially in plugin and theme directories.</w:t>
       </w:r>
     </w:p>
-    <w:bookmarkEnd w:id="86"/>
-    <w:bookmarkEnd w:id="87"/>
-    <w:bookmarkStart w:id="88" w:name="backup-and-recovery"/>
+    <w:bookmarkEnd w:id="70"/>
+    <w:bookmarkEnd w:id="71"/>
+    <w:bookmarkStart w:id="72" w:name="backup-and-recovery"/>
     <w:p>
       <w:pPr>
         <w:pStyle w:val="Heading2"/>
@@ -3898,8 +4068,8 @@
         <w:t xml:space="preserve">Document the recovery procedure and assign clear ownership.</w:t>
       </w:r>
     </w:p>
-    <w:bookmarkEnd w:id="88"/>
-    <w:bookmarkStart w:id="93" w:name="supply-chain-security"/>
+    <w:bookmarkEnd w:id="72"/>
+    <w:bookmarkStart w:id="77" w:name="supply-chain-security"/>
     <w:p>
       <w:pPr>
         <w:pStyle w:val="Heading2"/>
@@ -3924,7 +4094,7 @@
         <w:t xml:space="preserve">The scale of this risk is growing. The Verizon DBIR (2025) found that third-party involvement in breaches has doubled to 30%, driven in part by exploitation of software supply chain dependencies and partner-connected access. IBM’s Cost of a Data Breach Report (2025) found supply chain compromise to be the second most common initial attack vector (15% of breaches) with an average cost of $4.91 million — the highest cost amplifying factor across all breach categories. The Verizon report also found that exploitation of vulnerabilities in edge devices and VPN appliances increased from 3% to 22% of vulnerability-related breaches, with a median remediation time of 32 days and only 54% of affected devices fully patched during the reporting period. These trends are directly relevant to WordPress environments that rely on third-party plugins, themes, and hosting infrastructure.</w:t>
       </w:r>
     </w:p>
-    <w:bookmarkStart w:id="89" w:name="software-bill-of-materials-sbom"/>
+    <w:bookmarkStart w:id="73" w:name="software-bill-of-materials-sbom"/>
     <w:p>
       <w:pPr>
         <w:pStyle w:val="Heading3"/>
@@ -3997,7 +4167,7 @@
       <w:r>
         <w:t xml:space="preserve"> </w:t>
       </w:r>
-      <w:hyperlink r:id="rId63">
+      <w:hyperlink r:id="rId46">
         <w:r>
           <w:rPr>
             <w:rStyle w:val="Hyperlink"/>
@@ -4012,8 +4182,8 @@
         <w:t xml:space="preserve">§8.4 provides an auditable control for SBOM maintenance, including tooling recommendations and CI/CD integration guidance.</w:t>
       </w:r>
     </w:p>
-    <w:bookmarkEnd w:id="89"/>
-    <w:bookmarkStart w:id="90" w:name="plugin-and-theme-management"/>
+    <w:bookmarkEnd w:id="73"/>
+    <w:bookmarkStart w:id="74" w:name="plugin-and-theme-management"/>
     <w:p>
       <w:pPr>
         <w:pStyle w:val="Heading3"/>
@@ -4070,8 +4240,8 @@
         <w:t xml:space="preserve">Monitor plugin vulnerability disclosures and apply patches promptly.</w:t>
       </w:r>
     </w:p>
-    <w:bookmarkEnd w:id="90"/>
-    <w:bookmarkStart w:id="91" w:name="internal-toolchain-security"/>
+    <w:bookmarkEnd w:id="74"/>
+    <w:bookmarkStart w:id="75" w:name="internal-toolchain-security"/>
     <w:p>
       <w:pPr>
         <w:pStyle w:val="Heading3"/>
@@ -4128,8 +4298,8 @@
         <w:t xml:space="preserve">Conduct code reviews for custom plugins and theme code before deployment.</w:t>
       </w:r>
     </w:p>
-    <w:bookmarkEnd w:id="91"/>
-    <w:bookmarkStart w:id="92" w:name="integrity-verification"/>
+    <w:bookmarkEnd w:id="75"/>
+    <w:bookmarkStart w:id="76" w:name="integrity-verification"/>
     <w:p>
       <w:pPr>
         <w:pStyle w:val="Heading3"/>
@@ -4146,9 +4316,9 @@
         <w:t xml:space="preserve">Implement automated integrity checks to verify that the code on the production server matches the version-controlled source or the official WordPress.org checksums. Any unauthorized file changes should trigger immediate alerts.</w:t>
       </w:r>
     </w:p>
-    <w:bookmarkEnd w:id="92"/>
-    <w:bookmarkEnd w:id="93"/>
-    <w:bookmarkStart w:id="100" w:name="organizational-security-practices"/>
+    <w:bookmarkEnd w:id="76"/>
+    <w:bookmarkEnd w:id="77"/>
+    <w:bookmarkStart w:id="84" w:name="organizational-security-practices"/>
     <w:p>
       <w:pPr>
         <w:pStyle w:val="Heading2"/>
@@ -4165,7 +4335,7 @@
         <w:t xml:space="preserve">Technical controls alone are insufficient. The human element accounts for the majority of security incidents. Organizations must complement technical hardening with policies, training, and cultural practices.</w:t>
       </w:r>
     </w:p>
-    <w:bookmarkStart w:id="94" w:name="employee-and-third-party-access-policies"/>
+    <w:bookmarkStart w:id="78" w:name="employee-and-third-party-access-policies"/>
     <w:p>
       <w:pPr>
         <w:pStyle w:val="Heading3"/>
@@ -4240,8 +4410,8 @@
         <w:t xml:space="preserve">Terminate access promptly when employees or contractors depart.</w:t>
       </w:r>
     </w:p>
-    <w:bookmarkEnd w:id="94"/>
-    <w:bookmarkStart w:id="95" w:name="security-policies-and-governance"/>
+    <w:bookmarkEnd w:id="78"/>
+    <w:bookmarkStart w:id="79" w:name="security-policies-and-governance"/>
     <w:p>
       <w:pPr>
         <w:pStyle w:val="Heading3"/>
@@ -4338,8 +4508,8 @@
         <w:t xml:space="preserve">Establish an AI governance policy covering approved tools, acceptable use, data classification for AI inputs, and authentication requirements. IBM’s Cost of a Data Breach Report (2025) found that 63% of organizations lack AI governance policies and that shadow AI incidents added $200,000 to average breach costs ($670,000 for organizations with high shadow AI prevalence). See Section 14 for implementation guidance.</w:t>
       </w:r>
     </w:p>
-    <w:bookmarkEnd w:id="95"/>
-    <w:bookmarkStart w:id="97" w:name="incident-response"/>
+    <w:bookmarkEnd w:id="79"/>
+    <w:bookmarkStart w:id="81" w:name="incident-response"/>
     <w:p>
       <w:pPr>
         <w:pStyle w:val="Heading3"/>
@@ -4358,7 +4528,7 @@
       <w:r>
         <w:t xml:space="preserve"> </w:t>
       </w:r>
-      <w:hyperlink r:id="rId96">
+      <w:hyperlink r:id="rId80">
         <w:r>
           <w:rPr>
             <w:rStyle w:val="Hyperlink"/>
@@ -4509,7 +4679,7 @@
       <w:r>
         <w:t xml:space="preserve"> </w:t>
       </w:r>
-      <w:hyperlink r:id="rId76">
+      <w:hyperlink r:id="rId60">
         <w:r>
           <w:rPr>
             <w:rStyle w:val="Hyperlink"/>
@@ -4524,8 +4694,8 @@
         <w:t xml:space="preserve">§10.3 and §10.4.</w:t>
       </w:r>
     </w:p>
-    <w:bookmarkEnd w:id="97"/>
-    <w:bookmarkStart w:id="98" w:name="building-a-security-first-culture"/>
+    <w:bookmarkEnd w:id="81"/>
+    <w:bookmarkStart w:id="82" w:name="building-a-security-first-culture"/>
     <w:p>
       <w:pPr>
         <w:pStyle w:val="Heading3"/>
@@ -4586,8 +4756,8 @@
         <w:t xml:space="preserve">Empower all team members to identify and report potential compromise.</w:t>
       </w:r>
     </w:p>
-    <w:bookmarkEnd w:id="98"/>
-    <w:bookmarkStart w:id="99" w:name="privacy-and-data-protection"/>
+    <w:bookmarkEnd w:id="82"/>
+    <w:bookmarkStart w:id="83" w:name="privacy-and-data-protection"/>
     <w:p>
       <w:pPr>
         <w:pStyle w:val="Heading3"/>
@@ -4730,9 +4900,9 @@
         <w:t xml:space="preserve">Define and enforce data retention schedules. Automatically purge data that is no longer needed for its stated purpose.</w:t>
       </w:r>
     </w:p>
-    <w:bookmarkEnd w:id="99"/>
-    <w:bookmarkEnd w:id="100"/>
-    <w:bookmarkStart w:id="101" w:name="the-role-of-the-hosting-provider"/>
+    <w:bookmarkEnd w:id="83"/>
+    <w:bookmarkEnd w:id="84"/>
+    <w:bookmarkStart w:id="85" w:name="the-role-of-the-hosting-provider"/>
     <w:p>
       <w:pPr>
         <w:pStyle w:val="Heading2"/>
@@ -4806,7 +4976,7 @@
         </w:numPr>
       </w:pPr>
       <w:r>
-        <w:t xml:space="preserve">Relevant certifications: SOC 2, PCI DSS, GDPR-aligned data processing agreements, and for government/education, FedRAMP or equivalent.</w:t>
+        <w:t xml:space="preserve">Relevant assurance evidence: ISO/IEC 27001 certification, a current SOC 2 attestation report, PCI DSS validation, GDPR-aligned data processing agreements, and for government/education, FedRAMP authorization or equivalent.</w:t>
       </w:r>
     </w:p>
     <w:p>
@@ -4826,11 +4996,11 @@
         <w:pStyle w:val="FirstParagraph"/>
       </w:pPr>
       <w:r>
-        <w:t xml:space="preserve">Leading enterprise WordPress hosts hold certifications such as SOC 2, PCI DSS, and ISO 27001. WordPress VIP additionally holds FedRAMP authorization for United States federal projects. When evaluating hosting providers, verify that their specific certifications match your organization’s compliance requirements.</w:t>
-      </w:r>
-    </w:p>
-    <w:bookmarkEnd w:id="101"/>
-    <w:bookmarkStart w:id="109" w:name="ai-integration-security-in-wordpress"/>
+        <w:t xml:space="preserve">Leading enterprise WordPress hosts hold ISO/IEC 27001 certification, publish SOC 2 attestation reports, and maintain PCI DSS validation. WordPress VIP additionally holds FedRAMP authorization for United States federal projects. These are different kinds of evidence: a certification, an auditor’s report on a defined system and period, a validation against a payment standard, and a government authorization. When evaluating hosting providers, check the scope and date of each and verify that it matches your organization’s compliance requirements.</w:t>
+      </w:r>
+    </w:p>
+    <w:bookmarkEnd w:id="85"/>
+    <w:bookmarkStart w:id="96" w:name="ai-integration-security-in-wordpress"/>
     <w:p>
       <w:pPr>
         <w:pStyle w:val="Heading2"/>
@@ -4908,7 +5078,7 @@
       <w:r>
         <w:t xml:space="preserve"> </w:t>
       </w:r>
-      <w:hyperlink r:id="rId102">
+      <w:hyperlink r:id="rId86">
         <w:r>
           <w:rPr>
             <w:rStyle w:val="Hyperlink"/>
@@ -4925,7 +5095,7 @@
       <w:r>
         <w:t xml:space="preserve"> </w:t>
       </w:r>
-      <w:hyperlink r:id="rId103">
+      <w:hyperlink r:id="rId87">
         <w:r>
           <w:rPr>
             <w:rStyle w:val="Hyperlink"/>
@@ -4939,7 +5109,7 @@
       <w:r>
         <w:t xml:space="preserve"> </w:t>
       </w:r>
-      <w:hyperlink r:id="rId104">
+      <w:hyperlink r:id="rId88">
         <w:r>
           <w:rPr>
             <w:rStyle w:val="Hyperlink"/>
@@ -4953,7 +5123,7 @@
       <w:r>
         <w:t xml:space="preserve"> </w:t>
       </w:r>
-      <w:hyperlink r:id="rId105">
+      <w:hyperlink r:id="rId89">
         <w:r>
           <w:rPr>
             <w:rStyle w:val="Hyperlink"/>
@@ -4965,7 +5135,7 @@
         <w:t xml:space="preserve">. For enterprise teams, these are not merely convenience features; they create new secret-management, authorization-boundary, and provider-governance decisions that should be handled as part of the platform security model.</w:t>
       </w:r>
     </w:p>
-    <w:bookmarkStart w:id="106" w:name="ai-as-an-attack-vector"/>
+    <w:bookmarkStart w:id="90" w:name="ai-as-an-attack-vector"/>
     <w:p>
       <w:pPr>
         <w:pStyle w:val="Heading3"/>
@@ -5026,8 +5196,8 @@
         <w:t xml:space="preserve">using AI may accelerate the exploitation window for WordPress plugin vulnerabilities, increasing the urgency of timely patching and virtual patching.</w:t>
       </w:r>
     </w:p>
-    <w:bookmarkEnd w:id="106"/>
-    <w:bookmarkStart w:id="107" w:name="shadow-ai-and-governance"/>
+    <w:bookmarkEnd w:id="90"/>
+    <w:bookmarkStart w:id="91" w:name="shadow-ai-and-governance"/>
     <w:p>
       <w:pPr>
         <w:pStyle w:val="Heading3"/>
@@ -5052,8 +5222,8 @@
         <w:t xml:space="preserve">For WordPress teams, shadow AI risks include content contributors pasting sensitive draft content into public AI tools and developers using AI code assistants that may introduce vulnerabilities or leak proprietary code. Organizations should establish an AI acceptable use policy, maintain an inventory of approved AI tools, and enforce authentication controls on any AI service used in the content workflow.</w:t>
       </w:r>
     </w:p>
-    <w:bookmarkEnd w:id="107"/>
-    <w:bookmarkStart w:id="108" w:name="securing-ai-integrations-in-wordpress"/>
+    <w:bookmarkEnd w:id="91"/>
+    <w:bookmarkStart w:id="95" w:name="securing-ai-integrations-in-wordpress"/>
     <w:p>
       <w:pPr>
         <w:pStyle w:val="Heading3"/>
@@ -5111,90 +5281,21 @@
         <w:t xml:space="preserve"> </w:t>
       </w:r>
       <w:r>
-        <w:t xml:space="preserve">Sanitize and validate all user inputs used in AI prompts to prevent injection attacks that could trick the AI into revealing sensitive information or executing unauthorized commands. This applies to AI-powered chatbots, search features, and content generation tools integrated with WordPress.</w:t>
-      </w:r>
-    </w:p>
-    <w:p>
-      <w:pPr>
-        <w:pStyle w:val="Compact"/>
-        <w:numPr>
-          <w:ilvl w:val="0"/>
-          <w:numId w:val="1030"/>
-        </w:numPr>
-      </w:pPr>
-      <w:r>
-        <w:rPr>
-          <w:b/>
-          <w:bCs/>
-        </w:rPr>
-        <w:t xml:space="preserve">Output Sanitization:</w:t>
-      </w:r>
-      <w:r>
-        <w:t xml:space="preserve"> </w:t>
-      </w:r>
-      <w:r>
-        <w:t xml:space="preserve">Treat GenAI-generated content as untrusted user input. Always sanitize and escape AI outputs before displaying them on the site or executing them as code (e.g., in automated site management tools).</w:t>
-      </w:r>
-    </w:p>
-    <w:p>
-      <w:pPr>
-        <w:pStyle w:val="Compact"/>
-        <w:numPr>
-          <w:ilvl w:val="0"/>
-          <w:numId w:val="1030"/>
-        </w:numPr>
-      </w:pPr>
-      <w:r>
-        <w:rPr>
-          <w:b/>
-          <w:bCs/>
-        </w:rPr>
-        <w:t xml:space="preserve">Access Controls for AI Systems:</w:t>
-      </w:r>
-      <w:r>
-        <w:t xml:space="preserve"> </w:t>
-      </w:r>
-      <w:r>
-        <w:t xml:space="preserve">Implement proper authentication and authorization for all AI model endpoints and APIs. IBM found that 97% of AI-related breaches involved systems lacking proper access controls — apply the same role-based access control principles used for WordPress itself to any AI integrations.</w:t>
-      </w:r>
-    </w:p>
-    <w:p>
-      <w:pPr>
-        <w:pStyle w:val="Compact"/>
-        <w:numPr>
-          <w:ilvl w:val="0"/>
-          <w:numId w:val="1030"/>
-        </w:numPr>
-      </w:pPr>
-      <w:r>
-        <w:rPr>
-          <w:b/>
-          <w:bCs/>
-        </w:rPr>
-        <w:t xml:space="preserve">Client-Side Prompt Execution:</w:t>
-      </w:r>
-      <w:r>
-        <w:t xml:space="preserve"> </w:t>
-      </w:r>
-      <w:r>
-        <w:t xml:space="preserve">Treat arbitrary browser-side prompt execution as a high-privilege pattern. The</w:t>
-      </w:r>
-      <w:r>
-        <w:t xml:space="preserve"> </w:t>
-      </w:r>
-      <w:hyperlink r:id="rId103">
+        <w:t xml:space="preserve">Input validation reduces prompt injection but cannot prevent it (see</w:t>
+      </w:r>
+      <w:r>
+        <w:t xml:space="preserve"> </w:t>
+      </w:r>
+      <w:hyperlink r:id="rId92">
         <w:r>
           <w:rPr>
             <w:rStyle w:val="Hyperlink"/>
           </w:rPr>
-          <w:t xml:space="preserve">WordPress 7.0 JavaScript AI API</w:t>
+          <w:t xml:space="preserve">OWASP LLM01:2025</w:t>
         </w:r>
       </w:hyperlink>
       <w:r>
-        <w:t xml:space="preserve"> </w:t>
-      </w:r>
-      <w:r>
-        <w:t xml:space="preserve">uses REST endpoints under the hood and is intentionally restricted because it can send arbitrary prompts to configured providers. For general plugin and site features, prefer narrow server-side REST endpoints with granular permission checks, and keep prompt construction, provider selection, and connector configuration scoped server-side.</w:t>
+        <w:t xml:space="preserve">). Instructions can arrive as ordinary, well-formed text — typed by a user (direct injection) or carried in content the model retrieves, such as posts, comments, uploaded files, or web pages (indirect injection). Design on the assumption that the model can be manipulated: authorize every tool call and data access in deterministic code using the requesting user’s capabilities, give AI integrations least-privilege credentials, keep the set of available operations narrow, and require human approval for high-impact actions. This applies to AI-powered chatbots, search features, and content generation tools integrated with WordPress.</w:t>
       </w:r>
     </w:p>
     <w:p>
@@ -5210,6 +5311,89 @@
           <w:b/>
           <w:bCs/>
         </w:rPr>
+        <w:t xml:space="preserve">Output Handling:</w:t>
+      </w:r>
+      <w:r>
+        <w:t xml:space="preserve"> </w:t>
+      </w:r>
+      <w:r>
+        <w:t xml:space="preserve">Treat GenAI-generated content as untrusted user input. Sanitize and escape AI output before displaying it on the site. Escaping does not make generated code safe to run: code or commands produced by a model (for example, in automated site management tools) need human review, validation against an allowlist of permitted operations, and execution in an isolated, least-privilege environment.</w:t>
+      </w:r>
+    </w:p>
+    <w:p>
+      <w:pPr>
+        <w:pStyle w:val="Compact"/>
+        <w:numPr>
+          <w:ilvl w:val="0"/>
+          <w:numId w:val="1030"/>
+        </w:numPr>
+      </w:pPr>
+      <w:r>
+        <w:rPr>
+          <w:b/>
+          <w:bCs/>
+        </w:rPr>
+        <w:t xml:space="preserve">Access Controls for AI Systems:</w:t>
+      </w:r>
+      <w:r>
+        <w:t xml:space="preserve"> </w:t>
+      </w:r>
+      <w:r>
+        <w:t xml:space="preserve">Implement proper authentication and authorization for all AI model endpoints and APIs. IBM found that 97% of AI-related breaches involved systems lacking proper access controls — apply the same role-based access control principles used for WordPress itself to any AI integrations.</w:t>
+      </w:r>
+    </w:p>
+    <w:p>
+      <w:pPr>
+        <w:pStyle w:val="Compact"/>
+        <w:numPr>
+          <w:ilvl w:val="0"/>
+          <w:numId w:val="1030"/>
+        </w:numPr>
+      </w:pPr>
+      <w:r>
+        <w:rPr>
+          <w:b/>
+          <w:bCs/>
+        </w:rPr>
+        <w:t xml:space="preserve">Client-Side Prompt Execution:</w:t>
+      </w:r>
+      <w:r>
+        <w:t xml:space="preserve"> </w:t>
+      </w:r>
+      <w:r>
+        <w:t xml:space="preserve">Treat arbitrary browser-side prompt execution as a high-privilege pattern. The JavaScript AI client wrapper described in the</w:t>
+      </w:r>
+      <w:r>
+        <w:t xml:space="preserve"> </w:t>
+      </w:r>
+      <w:hyperlink r:id="rId87">
+        <w:r>
+          <w:rPr>
+            <w:rStyle w:val="Hyperlink"/>
+          </w:rPr>
+          <w:t xml:space="preserve">WordPress 7.0 AI Client dev note</w:t>
+        </w:r>
+      </w:hyperlink>
+      <w:r>
+        <w:t xml:space="preserve"> </w:t>
+      </w:r>
+      <w:r>
+        <w:t xml:space="preserve">is distributed separately from core; it uses REST endpoints under the hood and is intentionally restricted because it can send arbitrary prompts to configured providers. For general plugin and site features, prefer narrow server-side REST endpoints with granular permission checks, and keep prompt construction, provider selection, and connector configuration scoped server-side.</w:t>
+      </w:r>
+    </w:p>
+    <w:p>
+      <w:pPr>
+        <w:pStyle w:val="Compact"/>
+        <w:numPr>
+          <w:ilvl w:val="0"/>
+          <w:numId w:val="1030"/>
+        </w:numPr>
+      </w:pPr>
+      <w:r>
+        <w:rPr>
+          <w:b/>
+          <w:bCs/>
+        </w:rPr>
         <w:t xml:space="preserve">Abilities API Boundaries:</w:t>
       </w:r>
       <w:r>
@@ -5221,7 +5405,7 @@
       <w:r>
         <w:t xml:space="preserve"> </w:t>
       </w:r>
-      <w:hyperlink r:id="rId104">
+      <w:hyperlink r:id="rId88">
         <w:r>
           <w:rPr>
             <w:rStyle w:val="Hyperlink"/>
@@ -5248,7 +5432,98 @@
         <w:t xml:space="preserve"> </w:t>
       </w:r>
       <w:r>
-        <w:t xml:space="preserve">should follow the same least-privilege design expectations as any other capability-sensitive REST integration, especially where AI agents or workflow tools are involved.</w:t>
+        <w:t xml:space="preserve">should follow the same least-privilege design expectations as any other capability-sensitive REST integration, especially where AI agents or workflow tools are involved. WordPress 7.1 adds two things architects should account for. First, a</w:t>
+      </w:r>
+      <w:r>
+        <w:t xml:space="preserve"> </w:t>
+      </w:r>
+      <w:r>
+        <w:rPr>
+          <w:rStyle w:val="VerbatimChar"/>
+        </w:rPr>
+        <w:t xml:space="preserve">public</w:t>
+      </w:r>
+      <w:r>
+        <w:t xml:space="preserve"> </w:t>
+      </w:r>
+      <w:r>
+        <w:t xml:space="preserve">metadata flag (default</w:t>
+      </w:r>
+      <w:r>
+        <w:t xml:space="preserve"> </w:t>
+      </w:r>
+      <w:r>
+        <w:rPr>
+          <w:rStyle w:val="VerbatimChar"/>
+        </w:rPr>
+        <w:t xml:space="preserve">false</w:t>
+      </w:r>
+      <w:r>
+        <w:t xml:space="preserve">) now controls whether an ability is exposed to external clients;</w:t>
+      </w:r>
+      <w:r>
+        <w:t xml:space="preserve"> </w:t>
+      </w:r>
+      <w:hyperlink r:id="rId93">
+        <w:r>
+          <w:rPr>
+            <w:rStyle w:val="Hyperlink"/>
+          </w:rPr>
+          <w:t xml:space="preserve">the dev note is explicit</w:t>
+        </w:r>
+      </w:hyperlink>
+      <w:r>
+        <w:t xml:space="preserve"> </w:t>
+      </w:r>
+      <w:r>
+        <w:t xml:space="preserve">that exposure flags are not a security boundary, so authorization must live in each ability’s</w:t>
+      </w:r>
+      <w:r>
+        <w:t xml:space="preserve"> </w:t>
+      </w:r>
+      <w:r>
+        <w:rPr>
+          <w:rStyle w:val="VerbatimChar"/>
+        </w:rPr>
+        <w:t xml:space="preserve">permission_callback</w:t>
+      </w:r>
+      <w:r>
+        <w:t xml:space="preserve">. Second,</w:t>
+      </w:r>
+      <w:r>
+        <w:t xml:space="preserve"> </w:t>
+      </w:r>
+      <w:hyperlink r:id="rId94">
+        <w:r>
+          <w:rPr>
+            <w:rStyle w:val="Hyperlink"/>
+          </w:rPr>
+          <w:t xml:space="preserve">execution lifecycle filters</w:t>
+        </w:r>
+      </w:hyperlink>
+      <w:r>
+        <w:t xml:space="preserve"> </w:t>
+      </w:r>
+      <w:r>
+        <w:t xml:space="preserve">let any active plugin short-circuit an ability before its permission check runs (</w:t>
+      </w:r>
+      <w:r>
+        <w:rPr>
+          <w:rStyle w:val="VerbatimChar"/>
+        </w:rPr>
+        <w:t xml:space="preserve">wp_pre_execute_ability</w:t>
+      </w:r>
+      <w:r>
+        <w:t xml:space="preserve">) or overturn a denial (</w:t>
+      </w:r>
+      <w:r>
+        <w:rPr>
+          <w:rStyle w:val="VerbatimChar"/>
+        </w:rPr>
+        <w:t xml:space="preserve">wp_ability_permission_result</w:t>
+      </w:r>
+      <w:r>
+        <w:t xml:space="preserve">). Treat code that hooks those filters as part of the authorization surface and review it accordingly (see Benchmark §11.4).</w:t>
       </w:r>
     </w:p>
     <w:p>
@@ -5297,7 +5572,7 @@
       <w:r>
         <w:t xml:space="preserve"> </w:t>
       </w:r>
-      <w:hyperlink r:id="rId105">
+      <w:hyperlink r:id="rId89">
         <w:r>
           <w:rPr>
             <w:rStyle w:val="Hyperlink"/>
@@ -5327,9 +5602,9 @@
         <w:t xml:space="preserve">constants. Database-backed connector secrets are masked in the interface but not encrypted, so they should be treated as a lower-assurance fallback rather than the preferred operational model.</w:t>
       </w:r>
     </w:p>
-    <w:bookmarkEnd w:id="108"/>
-    <w:bookmarkEnd w:id="109"/>
-    <w:bookmarkStart w:id="133" w:name="additional-resources"/>
+    <w:bookmarkEnd w:id="95"/>
+    <w:bookmarkEnd w:id="96"/>
+    <w:bookmarkStart w:id="120" w:name="additional-resources"/>
     <w:p>
       <w:pPr>
         <w:pStyle w:val="Heading2"/>
@@ -5338,7 +5613,7 @@
         <w:t xml:space="preserve">15. Additional Resources</w:t>
       </w:r>
     </w:p>
-    <w:bookmarkStart w:id="114" w:name="wordpress-security-documentation"/>
+    <w:bookmarkStart w:id="101" w:name="wordpress-security-documentation"/>
     <w:p>
       <w:pPr>
         <w:pStyle w:val="Heading3"/>
@@ -5355,7 +5630,7 @@
           <w:numId w:val="1031"/>
         </w:numPr>
       </w:pPr>
-      <w:hyperlink r:id="rId110">
+      <w:hyperlink r:id="rId97">
         <w:r>
           <w:rPr>
             <w:rStyle w:val="Hyperlink"/>
@@ -5372,7 +5647,7 @@
           <w:numId w:val="1031"/>
         </w:numPr>
       </w:pPr>
-      <w:hyperlink r:id="rId42">
+      <w:hyperlink r:id="rId22">
         <w:r>
           <w:rPr>
             <w:rStyle w:val="Hyperlink"/>
@@ -5386,7 +5661,7 @@
       <w:r>
         <w:t xml:space="preserve">(</w:t>
       </w:r>
-      <w:hyperlink r:id="rId111">
+      <w:hyperlink r:id="rId98">
         <w:r>
           <w:rPr>
             <w:rStyle w:val="Hyperlink"/>
@@ -5406,7 +5681,7 @@
           <w:numId w:val="1031"/>
         </w:numPr>
       </w:pPr>
-      <w:hyperlink r:id="rId112">
+      <w:hyperlink r:id="rId99">
         <w:r>
           <w:rPr>
             <w:rStyle w:val="Hyperlink"/>
@@ -5423,7 +5698,7 @@
           <w:numId w:val="1031"/>
         </w:numPr>
       </w:pPr>
-      <w:hyperlink r:id="rId113">
+      <w:hyperlink r:id="rId100">
         <w:r>
           <w:rPr>
             <w:rStyle w:val="Hyperlink"/>
@@ -5432,8 +5707,8 @@
         </w:r>
       </w:hyperlink>
     </w:p>
-    <w:bookmarkEnd w:id="114"/>
-    <w:bookmarkStart w:id="123" w:name="threat-intelligence-and-industry-reports"/>
+    <w:bookmarkEnd w:id="101"/>
+    <w:bookmarkStart w:id="110" w:name="threat-intelligence-and-industry-reports"/>
     <w:p>
       <w:pPr>
         <w:pStyle w:val="Heading3"/>
@@ -5450,7 +5725,7 @@
           <w:numId w:val="1032"/>
         </w:numPr>
       </w:pPr>
-      <w:hyperlink r:id="rId115">
+      <w:hyperlink r:id="rId102">
         <w:r>
           <w:rPr>
             <w:rStyle w:val="Hyperlink"/>
@@ -5467,7 +5742,7 @@
           <w:numId w:val="1032"/>
         </w:numPr>
       </w:pPr>
-      <w:hyperlink r:id="rId116">
+      <w:hyperlink r:id="rId103">
         <w:r>
           <w:rPr>
             <w:rStyle w:val="Hyperlink"/>
@@ -5484,7 +5759,7 @@
           <w:numId w:val="1032"/>
         </w:numPr>
       </w:pPr>
-      <w:hyperlink r:id="rId117">
+      <w:hyperlink r:id="rId104">
         <w:r>
           <w:rPr>
             <w:rStyle w:val="Hyperlink"/>
@@ -5501,7 +5776,7 @@
           <w:numId w:val="1032"/>
         </w:numPr>
       </w:pPr>
-      <w:hyperlink r:id="rId118">
+      <w:hyperlink r:id="rId105">
         <w:r>
           <w:rPr>
             <w:rStyle w:val="Hyperlink"/>
@@ -5518,7 +5793,7 @@
           <w:numId w:val="1032"/>
         </w:numPr>
       </w:pPr>
-      <w:hyperlink r:id="rId119">
+      <w:hyperlink r:id="rId106">
         <w:r>
           <w:rPr>
             <w:rStyle w:val="Hyperlink"/>
@@ -5535,7 +5810,7 @@
           <w:numId w:val="1032"/>
         </w:numPr>
       </w:pPr>
-      <w:hyperlink r:id="rId120">
+      <w:hyperlink r:id="rId107">
         <w:r>
           <w:rPr>
             <w:rStyle w:val="Hyperlink"/>
@@ -5552,7 +5827,7 @@
           <w:numId w:val="1032"/>
         </w:numPr>
       </w:pPr>
-      <w:hyperlink r:id="rId121">
+      <w:hyperlink r:id="rId108">
         <w:r>
           <w:rPr>
             <w:rStyle w:val="Hyperlink"/>
@@ -5569,7 +5844,7 @@
           <w:numId w:val="1032"/>
         </w:numPr>
       </w:pPr>
-      <w:hyperlink r:id="rId122">
+      <w:hyperlink r:id="rId109">
         <w:r>
           <w:rPr>
             <w:rStyle w:val="Hyperlink"/>
@@ -5578,8 +5853,8 @@
         </w:r>
       </w:hyperlink>
     </w:p>
-    <w:bookmarkEnd w:id="123"/>
-    <w:bookmarkStart w:id="127" w:name="standards-and-frameworks"/>
+    <w:bookmarkEnd w:id="110"/>
+    <w:bookmarkStart w:id="114" w:name="standards-and-frameworks"/>
     <w:p>
       <w:pPr>
         <w:pStyle w:val="Heading3"/>
@@ -5596,7 +5871,7 @@
           <w:numId w:val="1033"/>
         </w:numPr>
       </w:pPr>
-      <w:hyperlink r:id="rId124">
+      <w:hyperlink r:id="rId111">
         <w:r>
           <w:rPr>
             <w:rStyle w:val="Hyperlink"/>
@@ -5613,7 +5888,7 @@
           <w:numId w:val="1033"/>
         </w:numPr>
       </w:pPr>
-      <w:hyperlink r:id="rId96">
+      <w:hyperlink r:id="rId80">
         <w:r>
           <w:rPr>
             <w:rStyle w:val="Hyperlink"/>
@@ -5630,7 +5905,7 @@
           <w:numId w:val="1033"/>
         </w:numPr>
       </w:pPr>
-      <w:hyperlink r:id="rId125">
+      <w:hyperlink r:id="rId112">
         <w:r>
           <w:rPr>
             <w:rStyle w:val="Hyperlink"/>
@@ -5647,7 +5922,7 @@
           <w:numId w:val="1033"/>
         </w:numPr>
       </w:pPr>
-      <w:hyperlink r:id="rId126">
+      <w:hyperlink r:id="rId113">
         <w:r>
           <w:rPr>
             <w:rStyle w:val="Hyperlink"/>
@@ -5656,8 +5931,8 @@
         </w:r>
       </w:hyperlink>
     </w:p>
-    <w:bookmarkEnd w:id="127"/>
-    <w:bookmarkStart w:id="130" w:name="X00fc8c82620e041623f6fee31e62d29d538d53d"/>
+    <w:bookmarkEnd w:id="114"/>
+    <w:bookmarkStart w:id="117" w:name="X00fc8c82620e041623f6fee31e62d29d538d53d"/>
     <w:p>
       <w:pPr>
         <w:pStyle w:val="Heading3"/>
@@ -5674,7 +5949,7 @@
           <w:numId w:val="1034"/>
         </w:numPr>
       </w:pPr>
-      <w:hyperlink r:id="rId128">
+      <w:hyperlink r:id="rId115">
         <w:r>
           <w:rPr>
             <w:rStyle w:val="Hyperlink"/>
@@ -5691,7 +5966,7 @@
           <w:numId w:val="1034"/>
         </w:numPr>
       </w:pPr>
-      <w:hyperlink r:id="rId129">
+      <w:hyperlink r:id="rId116">
         <w:r>
           <w:rPr>
             <w:rStyle w:val="Hyperlink"/>
@@ -5700,8 +5975,8 @@
         </w:r>
       </w:hyperlink>
     </w:p>
-    <w:bookmarkEnd w:id="130"/>
-    <w:bookmarkStart w:id="131" w:name="X55c9101f92aa676e1a168fbd28368937284e15a"/>
+    <w:bookmarkEnd w:id="117"/>
+    <w:bookmarkStart w:id="118" w:name="X55c9101f92aa676e1a168fbd28368937284e15a"/>
     <w:p>
       <w:pPr>
         <w:pStyle w:val="Heading3"/>
@@ -5858,8 +6133,8 @@
         <w:t xml:space="preserve">filter.</w:t>
       </w:r>
     </w:p>
-    <w:bookmarkEnd w:id="131"/>
-    <w:bookmarkStart w:id="132" w:name="X24eb9b3eb0d379335dea7aa77a9efbdf30a22dc"/>
+    <w:bookmarkEnd w:id="118"/>
+    <w:bookmarkStart w:id="119" w:name="X24eb9b3eb0d379335dea7aa77a9efbdf30a22dc"/>
     <w:p>
       <w:pPr>
         <w:pStyle w:val="Heading3"/>
@@ -6103,10 +6378,7 @@
               <w:jc w:val="left"/>
             </w:pPr>
             <w:r>
-              <w:t xml:space="preserve">Disable with</w:t>
-            </w:r>
-            <w:r>
-              <w:t xml:space="preserve"> </w:t>
+              <w:t xml:space="preserve">Block at the web server when unused (</w:t>
             </w:r>
             <w:r>
               <w:rPr>
@@ -6118,7 +6390,7 @@
               <w:t xml:space="preserve"> </w:t>
             </w:r>
             <w:r>
-              <w:t xml:space="preserve">and/or server-level block when unused</w:t>
+              <w:t xml:space="preserve">alone is partial: authenticated methods only)</w:t>
             </w:r>
           </w:p>
         </w:tc>
@@ -6236,9 +6508,9 @@
         </w:tc>
       </w:tr>
     </w:tbl>
-    <w:bookmarkEnd w:id="132"/>
-    <w:bookmarkEnd w:id="133"/>
-    <w:bookmarkStart w:id="134" w:name="related-documents"/>
+    <w:bookmarkEnd w:id="119"/>
+    <w:bookmarkEnd w:id="120"/>
+    <w:bookmarkStart w:id="121" w:name="related-documents"/>
     <w:p>
       <w:pPr>
         <w:pStyle w:val="Heading2"/>
@@ -6255,7 +6527,7 @@
           <w:numId w:val="1036"/>
         </w:numPr>
       </w:pPr>
-      <w:hyperlink r:id="rId63">
+      <w:hyperlink r:id="rId46">
         <w:r>
           <w:rPr>
             <w:rStyle w:val="Hyperlink"/>
@@ -6280,7 +6552,7 @@
           <w:numId w:val="1036"/>
         </w:numPr>
       </w:pPr>
-      <w:hyperlink r:id="rId67">
+      <w:hyperlink r:id="rId50">
         <w:r>
           <w:rPr>
             <w:rStyle w:val="Hyperlink"/>
@@ -6305,7 +6577,7 @@
           <w:numId w:val="1036"/>
         </w:numPr>
       </w:pPr>
-      <w:hyperlink r:id="rId76">
+      <w:hyperlink r:id="rId60">
         <w:r>
           <w:rPr>
             <w:rStyle w:val="Hyperlink"/>
@@ -6346,7 +6618,7 @@
       <w:r>
         <w:t xml:space="preserve"> </w:t>
       </w:r>
-      <w:hyperlink r:id="rId42">
+      <w:hyperlink r:id="rId22">
         <w:r>
           <w:rPr>
             <w:rStyle w:val="Hyperlink"/>
@@ -6360,7 +6632,7 @@
       <w:r>
         <w:t xml:space="preserve">(</w:t>
       </w:r>
-      <w:hyperlink r:id="rId111">
+      <w:hyperlink r:id="rId98">
         <w:r>
           <w:rPr>
             <w:rStyle w:val="Hyperlink"/>
@@ -6372,8 +6644,8 @@
         <w:t xml:space="preserve">).</w:t>
       </w:r>
     </w:p>
-    <w:bookmarkEnd w:id="134"/>
-    <w:bookmarkStart w:id="136" w:name="license-and-attribution"/>
+    <w:bookmarkEnd w:id="121"/>
+    <w:bookmarkStart w:id="123" w:name="license-and-attribution"/>
     <w:p>
       <w:pPr>
         <w:pStyle w:val="Heading2"/>
@@ -6392,7 +6664,7 @@
       <w:r>
         <w:t xml:space="preserve"> </w:t>
       </w:r>
-      <w:hyperlink r:id="rId135">
+      <w:hyperlink r:id="rId122">
         <w:r>
           <w:rPr>
             <w:rStyle w:val="Hyperlink"/>
@@ -6404,9 +6676,9 @@
         <w:t xml:space="preserve">. You may copy, redistribute, remix, transform, and build upon this material for any purpose, including commercial use, provided you give appropriate credit and distribute your contributions under the same license.</w:t>
       </w:r>
     </w:p>
-    <w:bookmarkEnd w:id="136"/>
+    <w:bookmarkEnd w:id="123"/>
     <w:sectPr>
-      <w:footerReference r:id="rId31" w:type="default"/>
+      <w:footerReference r:id="rId9" w:type="default"/>
       <w:footnotePr>
         <w:numRestart w:val="eachSect"/>
       </w:footnotePr>

</xml_diff>